<commit_message>
Restructure S8, settle the JADER mapping claim, set references in Vancouver style, add a Word manuscript
</commit_message>
<xml_diff>
--- a/submission/READUS-PV_checklist.docx
+++ b/submission/READUS-PV_checklist.docx
@@ -38,6 +38,10 @@
         <w:gridCol w:w="2160"/>
       </w:tblGrid>
       <w:tr>
+        <w:trPr>
+          <w:tblHeader w:val="true"/>
+          <w:cantSplit/>
+        </w:trPr>
         <w:tc>
           <w:tcPr>
             <w:tcW w:type="dxa" w:w="480"/>

</xml_diff>